<commit_message>
Ispravke iz audita, nove funkcije i migracija baza na MySQL
</commit_message>
<xml_diff>
--- a/UPUTSTVO.docx
+++ b/UPUTSTVO.docx
@@ -621,7 +621,7 @@
           <w:rFonts w:ascii="Arial" w:hAnsi="Arial"/>
           <w:sz w:val="22"/>
         </w:rPr>
-        <w:t>"Zaboravili ste lozinku?": forma za promenu lozinke (korisnicko ime/email/br telefona + nova lozinka + ponovite lozinku -&gt; "Promeni lozinku").</w:t>
+        <w:t>"Zaboravili ste lozinku?": forma za promenu lozinke (korisnicko ime/email/br telefona + nova lozinka + ponovite lozinku -&gt; "Promeni lozinku"). Zatim se trazi i drugi podatak sa naloga: broj telefona, ili korisnicko ime ako je prvo unet telefon.</w:t>
       </w:r>
     </w:p>
     <w:p>
@@ -710,6 +710,54 @@
     </w:p>
     <w:p>
       <w:pPr>
+        <w:pStyle w:val="ListBullet"/>
+      </w:pPr>
+      <w:r>
+        <w:rPr>
+          <w:rFonts w:ascii="Arial" w:hAnsi="Arial"/>
+          <w:sz w:val="22"/>
+        </w:rPr>
+        <w:t xml:space="preserve">Dugmad "Dodaj zaposlenog" i "Ukloni / deaktiviraj izabranog": zaposleni bez unosa se brise, a zaposleni sa unosima se deaktivira (vise ne moze da se prijavi, istorija ostaje).</w:t>
+      </w:r>
+    </w:p>
+    <w:p>
+      <w:pPr>
+        <w:pStyle w:val="ListBullet"/>
+      </w:pPr>
+      <w:r>
+        <w:rPr>
+          <w:rFonts w:ascii="Arial" w:hAnsi="Arial"/>
+          <w:sz w:val="22"/>
+        </w:rPr>
+        <w:t xml:space="preserve">"Dodaj novu uslugu" (naziv i cena) i "Dodaj novi resurs u magacin" (naziv sa jedinicom u zagradi, npr. Grickalice (g); resurs sa recju "hrana" pojavljuje se kod unosa hrane).</w:t>
+      </w:r>
+    </w:p>
+    <w:p>
+      <w:pPr>
+        <w:pStyle w:val="ListBullet"/>
+      </w:pPr>
+      <w:r>
+        <w:rPr>
+          <w:rFonts w:ascii="Arial" w:hAnsi="Arial"/>
+          <w:sz w:val="22"/>
+        </w:rPr>
+        <w:t xml:space="preserve">Ljubimci u pansionu: "Primi ljubimca u pansion" (vlasnik mora da ima nalog, boks mora da bude slobodan) i "Odjavi izabranog i napravi racun" (racun po cenovniku, boks se oslobadja, istorija ostaje).</w:t>
+      </w:r>
+    </w:p>
+    <w:p>
+      <w:pPr>
+        <w:pStyle w:val="ListBullet"/>
+      </w:pPr>
+      <w:r>
+        <w:rPr>
+          <w:rFonts w:ascii="Arial" w:hAnsi="Arial"/>
+          <w:sz w:val="22"/>
+        </w:rPr>
+        <w:t xml:space="preserve">Klik na svoje ime u zaglavlju otvara promenu lozinke.</w:t>
+      </w:r>
+    </w:p>
+    <w:p>
+      <w:pPr>
         <w:pStyle w:val="Heading2"/>
       </w:pPr>
       <w:r>
@@ -770,6 +818,42 @@
     </w:p>
     <w:p>
       <w:pPr>
+        <w:pStyle w:val="ListBullet"/>
+      </w:pPr>
+      <w:r>
+        <w:rPr>
+          <w:rFonts w:ascii="Arial" w:hAnsi="Arial"/>
+          <w:sz w:val="22"/>
+        </w:rPr>
+        <w:t xml:space="preserve">Kolicina moze da se unese sa jedinicom (280g, 1,5kg, 0,5l) i pretvara se u jedinicu resursa. Ako na stanju nema dovoljno, unos se odbija i nista se ne upisuje.</w:t>
+      </w:r>
+    </w:p>
+    <w:p>
+      <w:pPr>
+        <w:pStyle w:val="ListBullet"/>
+      </w:pPr>
+      <w:r>
+        <w:rPr>
+          <w:rFonts w:ascii="Arial" w:hAnsi="Arial"/>
+          <w:sz w:val="22"/>
+        </w:rPr>
+        <w:t xml:space="preserve">Radnik moze da ima samo jednu aktivnost "U toku"; nova se zapocinje kad se prethodna zavrsi (zuti baner na pocetnoj strani).</w:t>
+      </w:r>
+    </w:p>
+    <w:p>
+      <w:pPr>
+        <w:pStyle w:val="ListBullet"/>
+      </w:pPr>
+      <w:r>
+        <w:rPr>
+          <w:rFonts w:ascii="Arial" w:hAnsi="Arial"/>
+          <w:sz w:val="22"/>
+        </w:rPr>
+        <w:t xml:space="preserve">Odjavljeni ljubimci se ne prikazuju u listi. Klik na svoje ime u zaglavlju otvara promenu lozinke.</w:t>
+      </w:r>
+    </w:p>
+    <w:p>
+      <w:pPr>
         <w:pStyle w:val="Heading2"/>
       </w:pPr>
       <w:r>
@@ -802,6 +886,30 @@
           <w:sz w:val="22"/>
         </w:rPr>
         <w:t>Klik na stavku otvara detalje (popup). Musterija samo pregleda, ne unosi.</w:t>
+      </w:r>
+    </w:p>
+    <w:p>
+      <w:pPr>
+        <w:pStyle w:val="ListBullet"/>
+      </w:pPr>
+      <w:r>
+        <w:rPr>
+          <w:rFonts w:ascii="Arial" w:hAnsi="Arial"/>
+          <w:sz w:val="22"/>
+        </w:rPr>
+        <w:t xml:space="preserve">Ispod izbora ljubimca pise boravak i racun do sada; klik na taj red otvara ceo racun.</w:t>
+      </w:r>
+    </w:p>
+    <w:p>
+      <w:pPr>
+        <w:pStyle w:val="ListBullet"/>
+      </w:pPr>
+      <w:r>
+        <w:rPr>
+          <w:rFonts w:ascii="Arial" w:hAnsi="Arial"/>
+          <w:sz w:val="22"/>
+        </w:rPr>
+        <w:t xml:space="preserve">Musterija vidi samo svoje ljubimce. Nova musterija, dok nema ljubimca u pansionu, vidi poruku "Nemate ljubimce u pansionu".</w:t>
       </w:r>
     </w:p>
     <w:p/>
@@ -931,6 +1039,54 @@
     </w:p>
     <w:p>
       <w:pPr>
+        <w:pStyle w:val="ListNumber"/>
+      </w:pPr>
+      <w:r>
+        <w:rPr>
+          <w:rFonts w:ascii="Arial" w:hAnsi="Arial"/>
+          <w:sz w:val="22"/>
+        </w:rPr>
+        <w:t xml:space="preserve">Registruj novu musteriju (npr. vlasnik2). Odjava -&gt; admin -&gt; "Primi ljubimca u pansion" za vlasnik2, boks A3.</w:t>
+      </w:r>
+    </w:p>
+    <w:p>
+      <w:pPr>
+        <w:pStyle w:val="ListNumber"/>
+      </w:pPr>
+      <w:r>
+        <w:rPr>
+          <w:rFonts w:ascii="Arial" w:hAnsi="Arial"/>
+          <w:sz w:val="22"/>
+        </w:rPr>
+        <w:t xml:space="preserve">Odjava -&gt; osoblje -&gt; izaberi novog ljubimca -&gt; Hrana "Suva hrana (g)", kolicina 1,5kg -&gt; Potvrdi.</w:t>
+      </w:r>
+    </w:p>
+    <w:p>
+      <w:pPr>
+        <w:pStyle w:val="ListNumber"/>
+      </w:pPr>
+      <w:r>
+        <w:rPr>
+          <w:rFonts w:ascii="Arial" w:hAnsi="Arial"/>
+          <w:sz w:val="22"/>
+        </w:rPr>
+        <w:t xml:space="preserve">Odjava -&gt; vlasnik2 -&gt; ispod imena ljubimca pise "racun do sada: 300 RSD" (jedno hranjenje); klik prikazuje ceo racun.</w:t>
+      </w:r>
+    </w:p>
+    <w:p>
+      <w:pPr>
+        <w:pStyle w:val="ListNumber"/>
+      </w:pPr>
+      <w:r>
+        <w:rPr>
+          <w:rFonts w:ascii="Arial" w:hAnsi="Arial"/>
+          <w:sz w:val="22"/>
+        </w:rPr>
+        <w:t xml:space="preserve">Odjava -&gt; admin -&gt; izaberi ljubimca u listi "Ljubimci u pansionu" -&gt; "Odjavi izabranog i napravi racun".</w:t>
+      </w:r>
+    </w:p>
+    <w:p>
+      <w:pPr>
         <w:pStyle w:val="Heading1"/>
       </w:pPr>
       <w:r>
@@ -991,6 +1147,18 @@
     </w:p>
     <w:p>
       <w:pPr>
+        <w:pStyle w:val="ListBullet"/>
+      </w:pPr>
+      <w:r>
+        <w:rPr>
+          <w:rFonts w:ascii="Arial" w:hAnsi="Arial"/>
+          <w:sz w:val="22"/>
+        </w:rPr>
+        <w:t xml:space="preserve">pets.DatumPrijema i DatumOdjave = boravak u pansionu; racun je zbir cena usluga zabelezenih od dana prijema.</w:t>
+      </w:r>
+    </w:p>
+    <w:p>
+      <w:pPr>
         <w:pStyle w:val="Heading1"/>
       </w:pPr>
       <w:r>
@@ -1047,6 +1215,30 @@
           <w:sz w:val="22"/>
         </w:rPr>
         <w:t>Aplikacija je razvijana i testirana na Windows-u (RAD Studio 12).</w:t>
+      </w:r>
+    </w:p>
+    <w:p>
+      <w:pPr>
+        <w:pStyle w:val="ListBullet"/>
+      </w:pPr>
+      <w:r>
+        <w:rPr>
+          <w:rFonts w:ascii="Arial" w:hAnsi="Arial"/>
+          <w:sz w:val="22"/>
+        </w:rPr>
+        <w:t xml:space="preserve">Lozinke se u bazi cuvaju kao SHA-256 hes. Stare lozinke (obican tekst) pretvaraju se automatski pri pokretanju; nalozi iz tabele u odeljku 3 rade isto kao ranije.</w:t>
+      </w:r>
+    </w:p>
+    <w:p>
+      <w:pPr>
+        <w:pStyle w:val="ListBullet"/>
+      </w:pPr>
+      <w:r>
+        <w:rPr>
+          <w:rFonts w:ascii="Arial" w:hAnsi="Arial"/>
+          <w:sz w:val="22"/>
+        </w:rPr>
+        <w:t xml:space="preserve">Prelazak baze na MySQL (XAMPP): folder "migracija" pored foldera Delphi, uputstvo je u migracija\README.md.</w:t>
       </w:r>
     </w:p>
     <w:sectPr>

</xml_diff>

<commit_message>
Case study, novi README i uputstvo, Docker samo lokalno, ciscenje nekoriscenih fajlova
</commit_message>
<xml_diff>
--- a/UPUTSTVO.docx
+++ b/UPUTSTVO.docx
@@ -39,10 +39,989 @@
           <w:color w:val="666666"/>
           <w:sz w:val="19"/>
         </w:rPr>
-        <w:t>Tehnologija: Delphi FireMonkey (FMX) + SQLite (FireDAC)</w:t>
+        <w:t>Nova verzija: Delphi FMX + MySQL (MariaDB), Laravel API i web stranica. Originalna verzija: Delphi FMX + SQLite.</w:t>
       </w:r>
     </w:p>
     <w:p/>
+    <w:p>
+      <w:pPr>
+        <w:spacing w:before="240" w:after="120"/>
+        <w:jc w:val="center"/>
+      </w:pPr>
+      <w:r>
+        <w:rPr>
+          <w:rFonts w:ascii="Arial" w:hAnsi="Arial"/>
+          <w:b/>
+          <w:color w:val="1F3B66"/>
+          <w:sz w:val="34"/>
+        </w:rPr>
+        <w:t xml:space="preserve">DEO 1: NOVA VERZIJA (MySQL, API i web stranica)</w:t>
+      </w:r>
+    </w:p>
+    <w:p>
+      <w:pPr>
+        <w:pStyle w:val="Heading1"/>
+      </w:pPr>
+      <w:r>
+        <w:rPr>
+          <w:rFonts w:ascii="Arial" w:hAnsi="Arial"/>
+          <w:color w:val="1F3B66"/>
+        </w:rPr>
+        <w:t xml:space="preserve">1. Sta je novo</w:t>
+      </w:r>
+    </w:p>
+    <w:p>
+      <w:r>
+        <w:rPr>
+          <w:rFonts w:ascii="Arial" w:hAnsi="Arial"/>
+          <w:b w:val="0"/>
+          <w:i w:val="0"/>
+          <w:sz w:val="22"/>
+        </w:rPr>
+        <w:t xml:space="preserve">Ista aplikacija za pansion, prebacena sa lokalnog SQLite fajla na zajednicku MySQL bazu. Delphi aplikacija radi kao i ranije, a uz nju sada postoje REST API i web stranica za vlasnike, nad istom bazom.</w:t>
+      </w:r>
+    </w:p>
+    <w:p>
+      <w:pPr>
+        <w:pStyle w:val="ListBullet"/>
+      </w:pPr>
+      <w:r>
+        <w:rPr>
+          <w:rFonts w:ascii="Arial" w:hAnsi="Arial"/>
+          <w:sz w:val="22"/>
+        </w:rPr>
+        <w:t xml:space="preserve">Delphi radi nad MySQL bazom (XAMPP). Veza sa bazom je sifrovana (TLS). Aplikacija je 64-bitna (Win64).</w:t>
+      </w:r>
+    </w:p>
+    <w:p>
+      <w:pPr>
+        <w:pStyle w:val="ListBullet"/>
+      </w:pPr>
+      <w:r>
+        <w:rPr>
+          <w:rFonts w:ascii="Arial" w:hAnsi="Arial"/>
+          <w:sz w:val="22"/>
+        </w:rPr>
+        <w:t xml:space="preserve">Web stranica za vlasnike: Moji ljubimci, dnevnik, racun za boravak i postavljanje slike ljubimca. Slika postavljena na sajtu odmah se vidi i u Delphi-ju.</w:t>
+      </w:r>
+    </w:p>
+    <w:p>
+      <w:pPr>
+        <w:pStyle w:val="ListBullet"/>
+      </w:pPr>
+      <w:r>
+        <w:rPr>
+          <w:rFonts w:ascii="Arial" w:hAnsi="Arial"/>
+          <w:sz w:val="22"/>
+        </w:rPr>
+        <w:t xml:space="preserve">REST API (Laravel) za iste podatke. Postman kolekcija je u api\postman.</w:t>
+      </w:r>
+    </w:p>
+    <w:p>
+      <w:pPr>
+        <w:pStyle w:val="ListBullet"/>
+      </w:pPr>
+      <w:r>
+        <w:rPr>
+          <w:rFonts w:ascii="Arial" w:hAnsi="Arial"/>
+          <w:sz w:val="22"/>
+        </w:rPr>
+        <w:t xml:space="preserve">Aktivnost se bira iz cenovnika (padajuci meni). Za ono sto nije u cenovniku postoji "Druga aktivnost (bez naplate)" sa kratkim opisom.</w:t>
+      </w:r>
+    </w:p>
+    <w:p>
+      <w:pPr>
+        <w:pStyle w:val="ListBullet"/>
+      </w:pPr>
+      <w:r>
+        <w:rPr>
+          <w:rFonts w:ascii="Arial" w:hAnsi="Arial"/>
+          <w:sz w:val="22"/>
+        </w:rPr>
+        <w:t xml:space="preserve">Komentar i procena ponasanja se upisuju kad se aktivnost zavrsi (popup na pocetnoj strani osoblja), a ne unapred.</w:t>
+      </w:r>
+    </w:p>
+    <w:p>
+      <w:pPr>
+        <w:pStyle w:val="ListBullet"/>
+      </w:pPr>
+      <w:r>
+        <w:rPr>
+          <w:rFonts w:ascii="Arial" w:hAnsi="Arial"/>
+          <w:sz w:val="22"/>
+        </w:rPr>
+        <w:t xml:space="preserve">Na racunu se vide i besplatne aktivnosti, sa oznakom "ne naplacuje se".</w:t>
+      </w:r>
+    </w:p>
+    <w:p>
+      <w:pPr>
+        <w:pStyle w:val="Heading1"/>
+      </w:pPr>
+      <w:r>
+        <w:rPr>
+          <w:rFonts w:ascii="Arial" w:hAnsi="Arial"/>
+          <w:color w:val="1F3B66"/>
+        </w:rPr>
+        <w:t xml:space="preserve">2. Kako pokrenuti</w:t>
+      </w:r>
+    </w:p>
+    <w:p>
+      <w:pPr>
+        <w:pStyle w:val="Heading2"/>
+      </w:pPr>
+      <w:r>
+        <w:rPr>
+          <w:rFonts w:ascii="Arial" w:hAnsi="Arial"/>
+          <w:color w:val="1F3B66"/>
+        </w:rPr>
+        <w:t xml:space="preserve">A) Web stranica i API u Docker-u (najlakse)</w:t>
+      </w:r>
+    </w:p>
+    <w:p>
+      <w:r>
+        <w:rPr>
+          <w:rFonts w:ascii="Arial" w:hAnsi="Arial"/>
+          <w:b w:val="0"/>
+          <w:i w:val="0"/>
+          <w:sz w:val="22"/>
+        </w:rPr>
+        <w:t xml:space="preserve">Treba samo Docker Desktop. Podaci su izmisljeni (demo baza). Detaljno uputstvo: docker\README.md.</w:t>
+      </w:r>
+    </w:p>
+    <w:p>
+      <w:pPr>
+        <w:spacing w:after="60"/>
+        <w:ind w:left="567" w:hanging="340"/>
+      </w:pPr>
+      <w:r>
+        <w:rPr>
+          <w:rFonts w:ascii="Arial" w:hAnsi="Arial"/>
+          <w:b/>
+          <w:sz w:val="22"/>
+        </w:rPr>
+        <w:t xml:space="preserve">1.</w:t>
+      </w:r>
+      <w:r>
+        <w:rPr>
+          <w:rFonts w:ascii="Arial" w:hAnsi="Arial"/>
+          <w:sz w:val="22"/>
+        </w:rPr>
+        <w:tab/>
+        <w:t xml:space="preserve">Kopirati docker\env-primer.txt u koren repozitorijuma pod imenom .env i upisati APP_KEY (uputstvo je u tom fajlu).</w:t>
+      </w:r>
+    </w:p>
+    <w:p>
+      <w:pPr>
+        <w:spacing w:after="60"/>
+        <w:ind w:left="567" w:hanging="340"/>
+      </w:pPr>
+      <w:r>
+        <w:rPr>
+          <w:rFonts w:ascii="Arial" w:hAnsi="Arial"/>
+          <w:b/>
+          <w:sz w:val="22"/>
+        </w:rPr>
+        <w:t xml:space="preserve">2.</w:t>
+      </w:r>
+      <w:r>
+        <w:rPr>
+          <w:rFonts w:ascii="Arial" w:hAnsi="Arial"/>
+          <w:sz w:val="22"/>
+        </w:rPr>
+        <w:tab/>
+        <w:t xml:space="preserve">Iz korena repozitorijuma: docker compose up -d --build</w:t>
+      </w:r>
+    </w:p>
+    <w:p>
+      <w:pPr>
+        <w:spacing w:after="60"/>
+        <w:ind w:left="567" w:hanging="340"/>
+      </w:pPr>
+      <w:r>
+        <w:rPr>
+          <w:rFonts w:ascii="Arial" w:hAnsi="Arial"/>
+          <w:b/>
+          <w:sz w:val="22"/>
+        </w:rPr>
+        <w:t xml:space="preserve">3.</w:t>
+      </w:r>
+      <w:r>
+        <w:rPr>
+          <w:rFonts w:ascii="Arial" w:hAnsi="Arial"/>
+          <w:sz w:val="22"/>
+        </w:rPr>
+        <w:tab/>
+        <w:t xml:space="preserve">Otvoriti http://localhost:8080 i prijaviti se kao vlasnik1 / pass123.</w:t>
+      </w:r>
+    </w:p>
+    <w:p>
+      <w:pPr>
+        <w:pStyle w:val="Heading2"/>
+      </w:pPr>
+      <w:r>
+        <w:rPr>
+          <w:rFonts w:ascii="Arial" w:hAnsi="Arial"/>
+          <w:color w:val="1F3B66"/>
+        </w:rPr>
+        <w:t xml:space="preserve">B) Delphi nad MySQL-om (XAMPP)</w:t>
+      </w:r>
+    </w:p>
+    <w:p>
+      <w:pPr>
+        <w:spacing w:after="60"/>
+        <w:ind w:left="567" w:hanging="340"/>
+      </w:pPr>
+      <w:r>
+        <w:rPr>
+          <w:rFonts w:ascii="Arial" w:hAnsi="Arial"/>
+          <w:b/>
+          <w:sz w:val="22"/>
+        </w:rPr>
+        <w:t xml:space="preserve">1.</w:t>
+      </w:r>
+      <w:r>
+        <w:rPr>
+          <w:rFonts w:ascii="Arial" w:hAnsi="Arial"/>
+          <w:sz w:val="22"/>
+        </w:rPr>
+        <w:tab/>
+        <w:t xml:space="preserve">U XAMPP-u pokrenuti MySQL. Bazu poksipp pravi migracija: uputstvo je u migracija\README.md.</w:t>
+      </w:r>
+    </w:p>
+    <w:p>
+      <w:pPr>
+        <w:spacing w:after="60"/>
+        <w:ind w:left="567" w:hanging="340"/>
+      </w:pPr>
+      <w:r>
+        <w:rPr>
+          <w:rFonts w:ascii="Arial" w:hAnsi="Arial"/>
+          <w:b/>
+          <w:sz w:val="22"/>
+        </w:rPr>
+        <w:t xml:space="preserve">2.</w:t>
+      </w:r>
+      <w:r>
+        <w:rPr>
+          <w:rFonts w:ascii="Arial" w:hAnsi="Arial"/>
+          <w:sz w:val="22"/>
+        </w:rPr>
+        <w:tab/>
+        <w:t xml:space="preserve">Instalirati MariaDB Connector/C (64-bit) ili iskopirati libmariadb.dll pored poksi.exe.</w:t>
+      </w:r>
+    </w:p>
+    <w:p>
+      <w:pPr>
+        <w:spacing w:after="60"/>
+        <w:ind w:left="567" w:hanging="340"/>
+      </w:pPr>
+      <w:r>
+        <w:rPr>
+          <w:rFonts w:ascii="Arial" w:hAnsi="Arial"/>
+          <w:b/>
+          <w:sz w:val="22"/>
+        </w:rPr>
+        <w:t xml:space="preserve">3.</w:t>
+      </w:r>
+      <w:r>
+        <w:rPr>
+          <w:rFonts w:ascii="Arial" w:hAnsi="Arial"/>
+          <w:sz w:val="22"/>
+        </w:rPr>
+        <w:tab/>
+        <w:t xml:space="preserve">U Delphi-ju izabrati platformu Windows 64-bit, pa Project -&gt; Build -&gt; Run (F9).</w:t>
+      </w:r>
+    </w:p>
+    <w:p>
+      <w:pPr>
+        <w:spacing w:after="60"/>
+        <w:ind w:left="567" w:hanging="340"/>
+      </w:pPr>
+      <w:r>
+        <w:rPr>
+          <w:rFonts w:ascii="Arial" w:hAnsi="Arial"/>
+          <w:b/>
+          <w:sz w:val="22"/>
+        </w:rPr>
+        <w:t xml:space="preserve">4.</w:t>
+      </w:r>
+      <w:r>
+        <w:rPr>
+          <w:rFonts w:ascii="Arial" w:hAnsi="Arial"/>
+          <w:sz w:val="22"/>
+        </w:rPr>
+        <w:tab/>
+        <w:t xml:space="preserve">Pri prvom pokretanju pored poksi.exe nastaje poksi.ini. U njemu se podesavaju server, korisnik i putanja do sertifikata (SSL_CA). Sa Tip=SQLite aplikacija radi nad starom lokalnom bazom.</w:t>
+      </w:r>
+    </w:p>
+    <w:p>
+      <w:pPr>
+        <w:pStyle w:val="Heading2"/>
+      </w:pPr>
+      <w:r>
+        <w:rPr>
+          <w:rFonts w:ascii="Arial" w:hAnsi="Arial"/>
+          <w:color w:val="1F3B66"/>
+        </w:rPr>
+        <w:t xml:space="preserve">C) Web stranica i API preko XAMPP-a (bez Docker-a)</w:t>
+      </w:r>
+    </w:p>
+    <w:p>
+      <w:r>
+        <w:rPr>
+          <w:rFonts w:ascii="Arial" w:hAnsi="Arial"/>
+          <w:b w:val="0"/>
+          <w:i w:val="0"/>
+          <w:sz w:val="22"/>
+        </w:rPr>
+        <w:t xml:space="preserve">Ovako web stranica i Delphi rade nad istom bazom, pa se izmene iz jedne aplikacije odmah vide u drugoj. Uputstvo: api\README.md (composer install, php artisan migrate, php artisan serve). Sajt je tada na http://127.0.0.1:8000.</w:t>
+      </w:r>
+    </w:p>
+    <w:p>
+      <w:pPr>
+        <w:pStyle w:val="Heading1"/>
+      </w:pPr>
+      <w:r>
+        <w:rPr>
+          <w:rFonts w:ascii="Arial" w:hAnsi="Arial"/>
+          <w:color w:val="1F3B66"/>
+        </w:rPr>
+        <w:t xml:space="preserve">3. Nalozi za prijavu (demo baza u Docker-u)</w:t>
+      </w:r>
+    </w:p>
+    <w:tbl>
+      <w:tblPr>
+        <w:tblStyle w:val="LightGrid-Accent1"/>
+        <w:tblW w:type="auto" w:w="0"/>
+        <w:jc w:val="center"/>
+        <w:tblLook w:firstColumn="1" w:firstRow="1" w:lastColumn="0" w:lastRow="0" w:noHBand="0" w:noVBand="1" w:val="04A0"/>
+      </w:tblPr>
+      <w:tblGrid>
+        <w:gridCol w:w="1247"/>
+        <w:gridCol w:w="1134"/>
+        <w:gridCol w:w="3402"/>
+        <w:gridCol w:w="3855"/>
+      </w:tblGrid>
+      <w:tr>
+        <w:tc>
+          <w:tcPr>
+            <w:tcW w:type="dxa" w:w="1247"/>
+          </w:tcPr>
+          <w:p>
+            <w:r>
+              <w:rPr>
+                <w:rFonts w:ascii="Arial" w:hAnsi="Arial"/>
+                <w:b/>
+                <w:sz w:val="21"/>
+              </w:rPr>
+              <w:t xml:space="preserve">Nalog</w:t>
+            </w:r>
+          </w:p>
+        </w:tc>
+        <w:tc>
+          <w:tcPr>
+            <w:tcW w:type="dxa" w:w="1134"/>
+          </w:tcPr>
+          <w:p>
+            <w:r>
+              <w:rPr>
+                <w:rFonts w:ascii="Arial" w:hAnsi="Arial"/>
+                <w:b/>
+                <w:sz w:val="21"/>
+              </w:rPr>
+              <w:t xml:space="preserve">Lozinka</w:t>
+            </w:r>
+          </w:p>
+        </w:tc>
+        <w:tc>
+          <w:tcPr>
+            <w:tcW w:type="dxa" w:w="3402"/>
+          </w:tcPr>
+          <w:p>
+            <w:r>
+              <w:rPr>
+                <w:rFonts w:ascii="Arial" w:hAnsi="Arial"/>
+                <w:b/>
+                <w:sz w:val="21"/>
+              </w:rPr>
+              <w:t xml:space="preserve">Uloga</w:t>
+            </w:r>
+          </w:p>
+        </w:tc>
+        <w:tc>
+          <w:tcPr>
+            <w:tcW w:type="dxa" w:w="3855"/>
+          </w:tcPr>
+          <w:p>
+            <w:r>
+              <w:rPr>
+                <w:rFonts w:ascii="Arial" w:hAnsi="Arial"/>
+                <w:b/>
+                <w:sz w:val="21"/>
+              </w:rPr>
+              <w:t xml:space="preserve">Gde se koristi</w:t>
+            </w:r>
+          </w:p>
+        </w:tc>
+      </w:tr>
+      <w:tr>
+        <w:tc>
+          <w:tcPr>
+            <w:tcW w:type="dxa" w:w="1247"/>
+          </w:tcPr>
+          <w:p>
+            <w:r>
+              <w:rPr>
+                <w:rFonts w:ascii="Arial" w:hAnsi="Arial"/>
+                <w:sz w:val="20"/>
+              </w:rPr>
+              <w:t xml:space="preserve">admin</w:t>
+            </w:r>
+          </w:p>
+        </w:tc>
+        <w:tc>
+          <w:tcPr>
+            <w:tcW w:type="dxa" w:w="1134"/>
+          </w:tcPr>
+          <w:p>
+            <w:r>
+              <w:rPr>
+                <w:rFonts w:ascii="Arial" w:hAnsi="Arial"/>
+                <w:sz w:val="20"/>
+              </w:rPr>
+              <w:t xml:space="preserve">admin123</w:t>
+            </w:r>
+          </w:p>
+        </w:tc>
+        <w:tc>
+          <w:tcPr>
+            <w:tcW w:type="dxa" w:w="3402"/>
+          </w:tcPr>
+          <w:p>
+            <w:r>
+              <w:rPr>
+                <w:rFonts w:ascii="Arial" w:hAnsi="Arial"/>
+                <w:sz w:val="20"/>
+              </w:rPr>
+              <w:t xml:space="preserve">Administrator</w:t>
+            </w:r>
+          </w:p>
+        </w:tc>
+        <w:tc>
+          <w:tcPr>
+            <w:tcW w:type="dxa" w:w="3855"/>
+          </w:tcPr>
+          <w:p>
+            <w:r>
+              <w:rPr>
+                <w:rFonts w:ascii="Arial" w:hAnsi="Arial"/>
+                <w:sz w:val="20"/>
+              </w:rPr>
+              <w:t xml:space="preserve">Delphi i API</w:t>
+            </w:r>
+          </w:p>
+        </w:tc>
+      </w:tr>
+      <w:tr>
+        <w:tc>
+          <w:tcPr>
+            <w:tcW w:type="dxa" w:w="1247"/>
+          </w:tcPr>
+          <w:p>
+            <w:r>
+              <w:rPr>
+                <w:rFonts w:ascii="Arial" w:hAnsi="Arial"/>
+                <w:sz w:val="20"/>
+              </w:rPr>
+              <w:t xml:space="preserve">osoblje3</w:t>
+            </w:r>
+          </w:p>
+        </w:tc>
+        <w:tc>
+          <w:tcPr>
+            <w:tcW w:type="dxa" w:w="1134"/>
+          </w:tcPr>
+          <w:p>
+            <w:r>
+              <w:rPr>
+                <w:rFonts w:ascii="Arial" w:hAnsi="Arial"/>
+                <w:sz w:val="20"/>
+              </w:rPr>
+              <w:t xml:space="preserve">nikola123</w:t>
+            </w:r>
+          </w:p>
+        </w:tc>
+        <w:tc>
+          <w:tcPr>
+            <w:tcW w:type="dxa" w:w="3402"/>
+          </w:tcPr>
+          <w:p>
+            <w:r>
+              <w:rPr>
+                <w:rFonts w:ascii="Arial" w:hAnsi="Arial"/>
+                <w:sz w:val="20"/>
+              </w:rPr>
+              <w:t xml:space="preserve">Osoblje (Nikola Nikolic)</w:t>
+            </w:r>
+          </w:p>
+        </w:tc>
+        <w:tc>
+          <w:tcPr>
+            <w:tcW w:type="dxa" w:w="3855"/>
+          </w:tcPr>
+          <w:p>
+            <w:r>
+              <w:rPr>
+                <w:rFonts w:ascii="Arial" w:hAnsi="Arial"/>
+                <w:sz w:val="20"/>
+              </w:rPr>
+              <w:t xml:space="preserve">Delphi i API</w:t>
+            </w:r>
+          </w:p>
+        </w:tc>
+      </w:tr>
+      <w:tr>
+        <w:tc>
+          <w:tcPr>
+            <w:tcW w:type="dxa" w:w="1247"/>
+          </w:tcPr>
+          <w:p>
+            <w:r>
+              <w:rPr>
+                <w:rFonts w:ascii="Arial" w:hAnsi="Arial"/>
+                <w:sz w:val="20"/>
+              </w:rPr>
+              <w:t xml:space="preserve">osoblje4</w:t>
+            </w:r>
+          </w:p>
+        </w:tc>
+        <w:tc>
+          <w:tcPr>
+            <w:tcW w:type="dxa" w:w="1134"/>
+          </w:tcPr>
+          <w:p>
+            <w:r>
+              <w:rPr>
+                <w:rFonts w:ascii="Arial" w:hAnsi="Arial"/>
+                <w:sz w:val="20"/>
+              </w:rPr>
+              <w:t xml:space="preserve">jelena123</w:t>
+            </w:r>
+          </w:p>
+        </w:tc>
+        <w:tc>
+          <w:tcPr>
+            <w:tcW w:type="dxa" w:w="3402"/>
+          </w:tcPr>
+          <w:p>
+            <w:r>
+              <w:rPr>
+                <w:rFonts w:ascii="Arial" w:hAnsi="Arial"/>
+                <w:sz w:val="20"/>
+              </w:rPr>
+              <w:t xml:space="preserve">Osoblje (Jelena Jelic)</w:t>
+            </w:r>
+          </w:p>
+        </w:tc>
+        <w:tc>
+          <w:tcPr>
+            <w:tcW w:type="dxa" w:w="3855"/>
+          </w:tcPr>
+          <w:p>
+            <w:r>
+              <w:rPr>
+                <w:rFonts w:ascii="Arial" w:hAnsi="Arial"/>
+                <w:sz w:val="20"/>
+              </w:rPr>
+              <w:t xml:space="preserve">Delphi i API</w:t>
+            </w:r>
+          </w:p>
+        </w:tc>
+      </w:tr>
+      <w:tr>
+        <w:tc>
+          <w:tcPr>
+            <w:tcW w:type="dxa" w:w="1247"/>
+          </w:tcPr>
+          <w:p>
+            <w:r>
+              <w:rPr>
+                <w:rFonts w:ascii="Arial" w:hAnsi="Arial"/>
+                <w:sz w:val="20"/>
+              </w:rPr>
+              <w:t xml:space="preserve">vlasnik1</w:t>
+            </w:r>
+          </w:p>
+        </w:tc>
+        <w:tc>
+          <w:tcPr>
+            <w:tcW w:type="dxa" w:w="1134"/>
+          </w:tcPr>
+          <w:p>
+            <w:r>
+              <w:rPr>
+                <w:rFonts w:ascii="Arial" w:hAnsi="Arial"/>
+                <w:sz w:val="20"/>
+              </w:rPr>
+              <w:t xml:space="preserve">pass123</w:t>
+            </w:r>
+          </w:p>
+        </w:tc>
+        <w:tc>
+          <w:tcPr>
+            <w:tcW w:type="dxa" w:w="3402"/>
+          </w:tcPr>
+          <w:p>
+            <w:r>
+              <w:rPr>
+                <w:rFonts w:ascii="Arial" w:hAnsi="Arial"/>
+                <w:sz w:val="20"/>
+              </w:rPr>
+              <w:t xml:space="preserve">Vlasnik (Jovana Markovic): Reks i Maca</w:t>
+            </w:r>
+          </w:p>
+        </w:tc>
+        <w:tc>
+          <w:tcPr>
+            <w:tcW w:type="dxa" w:w="3855"/>
+          </w:tcPr>
+          <w:p>
+            <w:r>
+              <w:rPr>
+                <w:rFonts w:ascii="Arial" w:hAnsi="Arial"/>
+                <w:sz w:val="20"/>
+              </w:rPr>
+              <w:t xml:space="preserve">web stranica, Delphi i API</w:t>
+            </w:r>
+          </w:p>
+        </w:tc>
+      </w:tr>
+      <w:tr>
+        <w:tc>
+          <w:tcPr>
+            <w:tcW w:type="dxa" w:w="1247"/>
+          </w:tcPr>
+          <w:p>
+            <w:r>
+              <w:rPr>
+                <w:rFonts w:ascii="Arial" w:hAnsi="Arial"/>
+                <w:sz w:val="20"/>
+              </w:rPr>
+              <w:t xml:space="preserve">vlasnik2</w:t>
+            </w:r>
+          </w:p>
+        </w:tc>
+        <w:tc>
+          <w:tcPr>
+            <w:tcW w:type="dxa" w:w="1134"/>
+          </w:tcPr>
+          <w:p>
+            <w:r>
+              <w:rPr>
+                <w:rFonts w:ascii="Arial" w:hAnsi="Arial"/>
+                <w:sz w:val="20"/>
+              </w:rPr>
+              <w:t xml:space="preserve">pass123</w:t>
+            </w:r>
+          </w:p>
+        </w:tc>
+        <w:tc>
+          <w:tcPr>
+            <w:tcW w:type="dxa" w:w="3402"/>
+          </w:tcPr>
+          <w:p>
+            <w:r>
+              <w:rPr>
+                <w:rFonts w:ascii="Arial" w:hAnsi="Arial"/>
+                <w:sz w:val="20"/>
+              </w:rPr>
+              <w:t xml:space="preserve">Vlasnik (Petar Ilic): Zuca</w:t>
+            </w:r>
+          </w:p>
+        </w:tc>
+        <w:tc>
+          <w:tcPr>
+            <w:tcW w:type="dxa" w:w="3855"/>
+          </w:tcPr>
+          <w:p>
+            <w:r>
+              <w:rPr>
+                <w:rFonts w:ascii="Arial" w:hAnsi="Arial"/>
+                <w:sz w:val="20"/>
+              </w:rPr>
+              <w:t xml:space="preserve">web stranica, Delphi i API</w:t>
+            </w:r>
+          </w:p>
+        </w:tc>
+      </w:tr>
+    </w:tbl>
+    <w:p>
+      <w:r>
+        <w:rPr>
+          <w:rFonts w:ascii="Arial" w:hAnsi="Arial"/>
+          <w:b w:val="0"/>
+          <w:i/>
+          <w:sz w:val="22"/>
+        </w:rPr>
+        <w:t xml:space="preserve">Web stranica je samo za vlasnike. Zaposleni rade u Delphi aplikaciji.</w:t>
+      </w:r>
+    </w:p>
+    <w:p>
+      <w:pPr>
+        <w:pStyle w:val="Heading1"/>
+      </w:pPr>
+      <w:r>
+        <w:rPr>
+          <w:rFonts w:ascii="Arial" w:hAnsi="Arial"/>
+          <w:color w:val="1F3B66"/>
+        </w:rPr>
+        <w:t xml:space="preserve">4. Preporuceni test scenario (nova verzija)</w:t>
+      </w:r>
+    </w:p>
+    <w:p>
+      <w:r>
+        <w:rPr>
+          <w:rFonts w:ascii="Arial" w:hAnsi="Arial"/>
+          <w:b w:val="0"/>
+          <w:i w:val="0"/>
+          <w:sz w:val="22"/>
+        </w:rPr>
+        <w:t xml:space="preserve">Delphi i web stranica moraju da rade nad istom bazom (postavka B + C).</w:t>
+      </w:r>
+    </w:p>
+    <w:p>
+      <w:pPr>
+        <w:spacing w:after="60"/>
+        <w:ind w:left="567" w:hanging="340"/>
+      </w:pPr>
+      <w:r>
+        <w:rPr>
+          <w:rFonts w:ascii="Arial" w:hAnsi="Arial"/>
+          <w:b/>
+          <w:sz w:val="22"/>
+        </w:rPr>
+        <w:t xml:space="preserve">1.</w:t>
+      </w:r>
+      <w:r>
+        <w:rPr>
+          <w:rFonts w:ascii="Arial" w:hAnsi="Arial"/>
+          <w:sz w:val="22"/>
+        </w:rPr>
+        <w:tab/>
+        <w:t xml:space="preserve">Delphi, osoblje3 / nikola123: izabrati ljubimca, pa Aktivnosti -&gt; iz menija izabrati "Setnja" -&gt; Zapocni aktivnost.</w:t>
+      </w:r>
+    </w:p>
+    <w:p>
+      <w:pPr>
+        <w:spacing w:after="60"/>
+        <w:ind w:left="567" w:hanging="340"/>
+      </w:pPr>
+      <w:r>
+        <w:rPr>
+          <w:rFonts w:ascii="Arial" w:hAnsi="Arial"/>
+          <w:b/>
+          <w:sz w:val="22"/>
+        </w:rPr>
+        <w:t xml:space="preserve">2.</w:t>
+      </w:r>
+      <w:r>
+        <w:rPr>
+          <w:rFonts w:ascii="Arial" w:hAnsi="Arial"/>
+          <w:sz w:val="22"/>
+        </w:rPr>
+        <w:tab/>
+        <w:t xml:space="preserve">Na pocetnoj strani kliknuti zuti baner "U toku", upisati komentar i procenu ponasanja -&gt; Zavrsi aktivnost.</w:t>
+      </w:r>
+    </w:p>
+    <w:p>
+      <w:pPr>
+        <w:spacing w:after="60"/>
+        <w:ind w:left="567" w:hanging="340"/>
+      </w:pPr>
+      <w:r>
+        <w:rPr>
+          <w:rFonts w:ascii="Arial" w:hAnsi="Arial"/>
+          <w:b/>
+          <w:sz w:val="22"/>
+        </w:rPr>
+        <w:t xml:space="preserve">3.</w:t>
+      </w:r>
+      <w:r>
+        <w:rPr>
+          <w:rFonts w:ascii="Arial" w:hAnsi="Arial"/>
+          <w:sz w:val="22"/>
+        </w:rPr>
+        <w:tab/>
+        <w:t xml:space="preserve">Web stranica, vlasnik1 / pass123: Moji ljubimci -&gt; isti ljubimac. U dnevniku je setnja sa komentarom, a na racunu stavka Setnja.</w:t>
+      </w:r>
+    </w:p>
+    <w:p>
+      <w:pPr>
+        <w:spacing w:after="60"/>
+        <w:ind w:left="567" w:hanging="340"/>
+      </w:pPr>
+      <w:r>
+        <w:rPr>
+          <w:rFonts w:ascii="Arial" w:hAnsi="Arial"/>
+          <w:b/>
+          <w:sz w:val="22"/>
+        </w:rPr>
+        <w:t xml:space="preserve">4.</w:t>
+      </w:r>
+      <w:r>
+        <w:rPr>
+          <w:rFonts w:ascii="Arial" w:hAnsi="Arial"/>
+          <w:sz w:val="22"/>
+        </w:rPr>
+        <w:tab/>
+        <w:t xml:space="preserve">Delphi, osoblje3: Aktivnosti -&gt; "Druga aktivnost (bez naplate)", opis npr. "Trening poslusnosti" -&gt; zapoceti i zavrsiti.</w:t>
+      </w:r>
+    </w:p>
+    <w:p>
+      <w:pPr>
+        <w:spacing w:after="60"/>
+        <w:ind w:left="567" w:hanging="340"/>
+      </w:pPr>
+      <w:r>
+        <w:rPr>
+          <w:rFonts w:ascii="Arial" w:hAnsi="Arial"/>
+          <w:b/>
+          <w:sz w:val="22"/>
+        </w:rPr>
+        <w:t xml:space="preserve">5.</w:t>
+      </w:r>
+      <w:r>
+        <w:rPr>
+          <w:rFonts w:ascii="Arial" w:hAnsi="Arial"/>
+          <w:sz w:val="22"/>
+        </w:rPr>
+        <w:tab/>
+        <w:t xml:space="preserve">Web stranica: na racunu je "Trening poslusnosti" sa oznakom "ne naplacuje se", a ukupan iznos se nije promenio.</w:t>
+      </w:r>
+    </w:p>
+    <w:p>
+      <w:pPr>
+        <w:spacing w:after="60"/>
+        <w:ind w:left="567" w:hanging="340"/>
+      </w:pPr>
+      <w:r>
+        <w:rPr>
+          <w:rFonts w:ascii="Arial" w:hAnsi="Arial"/>
+          <w:b/>
+          <w:sz w:val="22"/>
+        </w:rPr>
+        <w:t xml:space="preserve">6.</w:t>
+      </w:r>
+      <w:r>
+        <w:rPr>
+          <w:rFonts w:ascii="Arial" w:hAnsi="Arial"/>
+          <w:sz w:val="22"/>
+        </w:rPr>
+        <w:tab/>
+        <w:t xml:space="preserve">Delphi, admin / admin123: Ljubimci u pansionu -&gt; "Odjavi izabranog i napravi racun". Racun ima iste stavke kao na sajtu.</w:t>
+      </w:r>
+    </w:p>
+    <w:p>
+      <w:pPr>
+        <w:pStyle w:val="Heading1"/>
+      </w:pPr>
+      <w:r>
+        <w:rPr>
+          <w:rFonts w:ascii="Arial" w:hAnsi="Arial"/>
+          <w:color w:val="1F3B66"/>
+        </w:rPr>
+        <w:t xml:space="preserve">5. Gde je ostala dokumentacija</w:t>
+      </w:r>
+    </w:p>
+    <w:p>
+      <w:pPr>
+        <w:pStyle w:val="ListBullet"/>
+      </w:pPr>
+      <w:r>
+        <w:rPr>
+          <w:rFonts w:ascii="Arial" w:hAnsi="Arial"/>
+          <w:sz w:val="22"/>
+        </w:rPr>
+        <w:t xml:space="preserve">README.md: pregled projekta i mapa foldera.</w:t>
+      </w:r>
+    </w:p>
+    <w:p>
+      <w:pPr>
+        <w:pStyle w:val="ListBullet"/>
+      </w:pPr>
+      <w:r>
+        <w:rPr>
+          <w:rFonts w:ascii="Arial" w:hAnsi="Arial"/>
+          <w:sz w:val="22"/>
+        </w:rPr>
+        <w:t xml:space="preserve">CASE_STUDY.md: kako je izvedena modernizacija (na engleskom).</w:t>
+      </w:r>
+    </w:p>
+    <w:p>
+      <w:pPr>
+        <w:pStyle w:val="ListBullet"/>
+      </w:pPr>
+      <w:r>
+        <w:rPr>
+          <w:rFonts w:ascii="Arial" w:hAnsi="Arial"/>
+          <w:sz w:val="22"/>
+        </w:rPr>
+        <w:t xml:space="preserve">migracija\README.md: prelazak baze sa SQLite-a na MySQL.</w:t>
+      </w:r>
+    </w:p>
+    <w:p>
+      <w:pPr>
+        <w:pStyle w:val="ListBullet"/>
+      </w:pPr>
+      <w:r>
+        <w:rPr>
+          <w:rFonts w:ascii="Arial" w:hAnsi="Arial"/>
+          <w:sz w:val="22"/>
+        </w:rPr>
+        <w:t xml:space="preserve">api\README.md: API, web stranica, uloge i rute.</w:t>
+      </w:r>
+    </w:p>
+    <w:p>
+      <w:pPr>
+        <w:pStyle w:val="ListBullet"/>
+      </w:pPr>
+      <w:r>
+        <w:rPr>
+          <w:rFonts w:ascii="Arial" w:hAnsi="Arial"/>
+          <w:sz w:val="22"/>
+        </w:rPr>
+        <w:t xml:space="preserve">docker\README.md: pokretanje u Docker-u.</w:t>
+      </w:r>
+    </w:p>
+    <w:p>
+      <w:pPr>
+        <w:spacing w:before="240" w:after="120"/>
+        <w:jc w:val="center"/>
+      </w:pPr>
+      <w:r>
+        <w:br w:type="page"/>
+      </w:r>
+      <w:r>
+        <w:rPr>
+          <w:rFonts w:ascii="Arial" w:hAnsi="Arial"/>
+          <w:b/>
+          <w:color w:val="1F3B66"/>
+          <w:sz w:val="34"/>
+        </w:rPr>
+        <w:t xml:space="preserve">DEO 2: ORIGINALNA VERZIJA (SQLite)</w:t>
+      </w:r>
+    </w:p>
+    <w:p>
+      <w:r>
+        <w:rPr>
+          <w:rFonts w:ascii="Arial" w:hAnsi="Arial"/>
+          <w:b w:val="0"/>
+          <w:i/>
+          <w:sz w:val="22"/>
+        </w:rPr>
+        <w:t xml:space="preserve">Uputstvo ispod je za prvu verziju aplikacije, pre prelaska na MySQL. Ostavljeno je onako kako je napisano za predmet.</w:t>
+      </w:r>
+    </w:p>
     <w:p>
       <w:pPr>
         <w:pStyle w:val="Heading1"/>

</xml_diff>